<commit_message>
docs(evidence): update Spanish testing results
</commit_message>
<xml_diff>
--- a/06_DOCUMENTACION_DE_PRUEBAS/ES/WORD/06_Documentacion_de_Pruebas.docx
+++ b/06_DOCUMENTACION_DE_PRUEBAS/ES/WORD/06_Documentacion_de_Pruebas.docx
@@ -507,7 +507,7 @@
           <w:kern w:val="2"/>
           <w:sz w:val="24"/>
           <w:szCs w:val="24"/>
-          <w:lang w:val="es-CO"/>
+          <w:lang w:val="es-419" w:eastAsia="es-419"/>
           <w14:ligatures w14:val="standardContextual"/>
         </w:rPr>
       </w:pPr>
@@ -520,7 +520,7 @@
       <w:r>
         <w:fldChar w:fldCharType="separate"/>
       </w:r>
-      <w:hyperlink w:anchor="_Toc242459436" w:history="1">
+      <w:hyperlink w:anchor="_Toc243049458" w:history="1">
         <w:r>
           <w:rPr>
             <w:rStyle w:val="Hipervnculo"/>
@@ -547,7 +547,7 @@
             <w:noProof/>
             <w:webHidden/>
           </w:rPr>
-          <w:instrText xml:space="preserve"> PAGEREF _Toc242459436 \h </w:instrText>
+          <w:instrText xml:space="preserve"> PAGEREF _Toc243049458 \h </w:instrText>
         </w:r>
         <w:r>
           <w:rPr>
@@ -591,11 +591,11 @@
           <w:kern w:val="2"/>
           <w:sz w:val="24"/>
           <w:szCs w:val="24"/>
-          <w:lang w:val="es-CO"/>
+          <w:lang w:val="es-419" w:eastAsia="es-419"/>
           <w14:ligatures w14:val="standardContextual"/>
         </w:rPr>
       </w:pPr>
-      <w:hyperlink w:anchor="_Toc242459437" w:history="1">
+      <w:hyperlink w:anchor="_Toc243049459" w:history="1">
         <w:r>
           <w:rPr>
             <w:rStyle w:val="Hipervnculo"/>
@@ -622,7 +622,7 @@
             <w:noProof/>
             <w:webHidden/>
           </w:rPr>
-          <w:instrText xml:space="preserve"> PAGEREF _Toc242459437 \h </w:instrText>
+          <w:instrText xml:space="preserve"> PAGEREF _Toc243049459 \h </w:instrText>
         </w:r>
         <w:r>
           <w:rPr>
@@ -666,11 +666,11 @@
           <w:kern w:val="2"/>
           <w:sz w:val="24"/>
           <w:szCs w:val="24"/>
-          <w:lang w:val="es-CO"/>
+          <w:lang w:val="es-419" w:eastAsia="es-419"/>
           <w14:ligatures w14:val="standardContextual"/>
         </w:rPr>
       </w:pPr>
-      <w:hyperlink w:anchor="_Toc242459438" w:history="1">
+      <w:hyperlink w:anchor="_Toc243049460" w:history="1">
         <w:r>
           <w:rPr>
             <w:rStyle w:val="Hipervnculo"/>
@@ -697,7 +697,7 @@
             <w:noProof/>
             <w:webHidden/>
           </w:rPr>
-          <w:instrText xml:space="preserve"> PAGEREF _Toc242459438 \h </w:instrText>
+          <w:instrText xml:space="preserve"> PAGEREF _Toc243049460 \h </w:instrText>
         </w:r>
         <w:r>
           <w:rPr>
@@ -741,11 +741,11 @@
           <w:kern w:val="2"/>
           <w:sz w:val="24"/>
           <w:szCs w:val="24"/>
-          <w:lang w:val="es-CO"/>
+          <w:lang w:val="es-419" w:eastAsia="es-419"/>
           <w14:ligatures w14:val="standardContextual"/>
         </w:rPr>
       </w:pPr>
-      <w:hyperlink w:anchor="_Toc242459439" w:history="1">
+      <w:hyperlink w:anchor="_Toc243049461" w:history="1">
         <w:r>
           <w:rPr>
             <w:rStyle w:val="Hipervnculo"/>
@@ -772,7 +772,7 @@
             <w:noProof/>
             <w:webHidden/>
           </w:rPr>
-          <w:instrText xml:space="preserve"> PAGEREF _Toc242459439 \h </w:instrText>
+          <w:instrText xml:space="preserve"> PAGEREF _Toc243049461 \h </w:instrText>
         </w:r>
         <w:r>
           <w:rPr>
@@ -816,11 +816,11 @@
           <w:kern w:val="2"/>
           <w:sz w:val="24"/>
           <w:szCs w:val="24"/>
-          <w:lang w:val="es-CO"/>
+          <w:lang w:val="es-419" w:eastAsia="es-419"/>
           <w14:ligatures w14:val="standardContextual"/>
         </w:rPr>
       </w:pPr>
-      <w:hyperlink w:anchor="_Toc242459440" w:history="1">
+      <w:hyperlink w:anchor="_Toc243049462" w:history="1">
         <w:r>
           <w:rPr>
             <w:rStyle w:val="Hipervnculo"/>
@@ -847,7 +847,7 @@
             <w:noProof/>
             <w:webHidden/>
           </w:rPr>
-          <w:instrText xml:space="preserve"> PAGEREF _Toc242459440 \h </w:instrText>
+          <w:instrText xml:space="preserve"> PAGEREF _Toc243049462 \h </w:instrText>
         </w:r>
         <w:r>
           <w:rPr>
@@ -891,11 +891,11 @@
           <w:kern w:val="2"/>
           <w:sz w:val="24"/>
           <w:szCs w:val="24"/>
-          <w:lang w:val="es-CO"/>
+          <w:lang w:val="es-419" w:eastAsia="es-419"/>
           <w14:ligatures w14:val="standardContextual"/>
         </w:rPr>
       </w:pPr>
-      <w:hyperlink w:anchor="_Toc242459441" w:history="1">
+      <w:hyperlink w:anchor="_Toc243049463" w:history="1">
         <w:r>
           <w:rPr>
             <w:rStyle w:val="Hipervnculo"/>
@@ -922,7 +922,7 @@
             <w:noProof/>
             <w:webHidden/>
           </w:rPr>
-          <w:instrText xml:space="preserve"> PAGEREF _Toc242459441 \h </w:instrText>
+          <w:instrText xml:space="preserve"> PAGEREF _Toc243049463 \h </w:instrText>
         </w:r>
         <w:r>
           <w:rPr>
@@ -966,11 +966,11 @@
           <w:kern w:val="2"/>
           <w:sz w:val="24"/>
           <w:szCs w:val="24"/>
-          <w:lang w:val="es-CO"/>
+          <w:lang w:val="es-419" w:eastAsia="es-419"/>
           <w14:ligatures w14:val="standardContextual"/>
         </w:rPr>
       </w:pPr>
-      <w:hyperlink w:anchor="_Toc242459442" w:history="1">
+      <w:hyperlink w:anchor="_Toc243049464" w:history="1">
         <w:r>
           <w:rPr>
             <w:rStyle w:val="Hipervnculo"/>
@@ -997,7 +997,7 @@
             <w:noProof/>
             <w:webHidden/>
           </w:rPr>
-          <w:instrText xml:space="preserve"> PAGEREF _Toc242459442 \h </w:instrText>
+          <w:instrText xml:space="preserve"> PAGEREF _Toc243049464 \h </w:instrText>
         </w:r>
         <w:r>
           <w:rPr>
@@ -1041,11 +1041,11 @@
           <w:kern w:val="2"/>
           <w:sz w:val="24"/>
           <w:szCs w:val="24"/>
-          <w:lang w:val="es-CO"/>
+          <w:lang w:val="es-419" w:eastAsia="es-419"/>
           <w14:ligatures w14:val="standardContextual"/>
         </w:rPr>
       </w:pPr>
-      <w:hyperlink w:anchor="_Toc242459443" w:history="1">
+      <w:hyperlink w:anchor="_Toc243049465" w:history="1">
         <w:r>
           <w:rPr>
             <w:rStyle w:val="Hipervnculo"/>
@@ -1072,7 +1072,7 @@
             <w:noProof/>
             <w:webHidden/>
           </w:rPr>
-          <w:instrText xml:space="preserve"> PAGEREF _Toc242459443 \h </w:instrText>
+          <w:instrText xml:space="preserve"> PAGEREF _Toc243049465 \h </w:instrText>
         </w:r>
         <w:r>
           <w:rPr>
@@ -1116,11 +1116,11 @@
           <w:kern w:val="2"/>
           <w:sz w:val="24"/>
           <w:szCs w:val="24"/>
-          <w:lang w:val="es-CO"/>
+          <w:lang w:val="es-419" w:eastAsia="es-419"/>
           <w14:ligatures w14:val="standardContextual"/>
         </w:rPr>
       </w:pPr>
-      <w:hyperlink w:anchor="_Toc242459444" w:history="1">
+      <w:hyperlink w:anchor="_Toc243049466" w:history="1">
         <w:r>
           <w:rPr>
             <w:rStyle w:val="Hipervnculo"/>
@@ -1147,7 +1147,7 @@
             <w:noProof/>
             <w:webHidden/>
           </w:rPr>
-          <w:instrText xml:space="preserve"> PAGEREF _Toc242459444 \h </w:instrText>
+          <w:instrText xml:space="preserve"> PAGEREF _Toc243049466 \h </w:instrText>
         </w:r>
         <w:r>
           <w:rPr>
@@ -1191,11 +1191,11 @@
           <w:kern w:val="2"/>
           <w:sz w:val="24"/>
           <w:szCs w:val="24"/>
-          <w:lang w:val="es-CO"/>
+          <w:lang w:val="es-419" w:eastAsia="es-419"/>
           <w14:ligatures w14:val="standardContextual"/>
         </w:rPr>
       </w:pPr>
-      <w:hyperlink w:anchor="_Toc242459445" w:history="1">
+      <w:hyperlink w:anchor="_Toc243049467" w:history="1">
         <w:r>
           <w:rPr>
             <w:rStyle w:val="Hipervnculo"/>
@@ -1222,7 +1222,7 @@
             <w:noProof/>
             <w:webHidden/>
           </w:rPr>
-          <w:instrText xml:space="preserve"> PAGEREF _Toc242459445 \h </w:instrText>
+          <w:instrText xml:space="preserve"> PAGEREF _Toc243049467 \h </w:instrText>
         </w:r>
         <w:r>
           <w:rPr>
@@ -1266,11 +1266,11 @@
           <w:kern w:val="2"/>
           <w:sz w:val="24"/>
           <w:szCs w:val="24"/>
-          <w:lang w:val="es-CO"/>
+          <w:lang w:val="es-419" w:eastAsia="es-419"/>
           <w14:ligatures w14:val="standardContextual"/>
         </w:rPr>
       </w:pPr>
-      <w:hyperlink w:anchor="_Toc242459446" w:history="1">
+      <w:hyperlink w:anchor="_Toc243049468" w:history="1">
         <w:r>
           <w:rPr>
             <w:rStyle w:val="Hipervnculo"/>
@@ -1297,7 +1297,7 @@
             <w:noProof/>
             <w:webHidden/>
           </w:rPr>
-          <w:instrText xml:space="preserve"> PAGEREF _Toc242459446 \h </w:instrText>
+          <w:instrText xml:space="preserve"> PAGEREF _Toc243049468 \h </w:instrText>
         </w:r>
         <w:r>
           <w:rPr>
@@ -1341,11 +1341,11 @@
           <w:kern w:val="2"/>
           <w:sz w:val="24"/>
           <w:szCs w:val="24"/>
-          <w:lang w:val="es-CO"/>
+          <w:lang w:val="es-419" w:eastAsia="es-419"/>
           <w14:ligatures w14:val="standardContextual"/>
         </w:rPr>
       </w:pPr>
-      <w:hyperlink w:anchor="_Toc242459447" w:history="1">
+      <w:hyperlink w:anchor="_Toc243049469" w:history="1">
         <w:r>
           <w:rPr>
             <w:rStyle w:val="Hipervnculo"/>
@@ -1372,7 +1372,7 @@
             <w:noProof/>
             <w:webHidden/>
           </w:rPr>
-          <w:instrText xml:space="preserve"> PAGEREF _Toc242459447 \h </w:instrText>
+          <w:instrText xml:space="preserve"> PAGEREF _Toc243049469 \h </w:instrText>
         </w:r>
         <w:r>
           <w:rPr>
@@ -1392,7 +1392,7 @@
             <w:noProof/>
             <w:webHidden/>
           </w:rPr>
-          <w:t>7</w:t>
+          <w:t>8</w:t>
         </w:r>
         <w:r>
           <w:rPr>
@@ -1416,11 +1416,11 @@
           <w:kern w:val="2"/>
           <w:sz w:val="24"/>
           <w:szCs w:val="24"/>
-          <w:lang w:val="es-CO"/>
+          <w:lang w:val="es-419" w:eastAsia="es-419"/>
           <w14:ligatures w14:val="standardContextual"/>
         </w:rPr>
       </w:pPr>
-      <w:hyperlink w:anchor="_Toc242459448" w:history="1">
+      <w:hyperlink w:anchor="_Toc243049470" w:history="1">
         <w:r>
           <w:rPr>
             <w:rStyle w:val="Hipervnculo"/>
@@ -1447,7 +1447,7 @@
             <w:noProof/>
             <w:webHidden/>
           </w:rPr>
-          <w:instrText xml:space="preserve"> PAGEREF _Toc242459448 \h </w:instrText>
+          <w:instrText xml:space="preserve"> PAGEREF _Toc243049470 \h </w:instrText>
         </w:r>
         <w:r>
           <w:rPr>
@@ -1467,7 +1467,7 @@
             <w:noProof/>
             <w:webHidden/>
           </w:rPr>
-          <w:t>7</w:t>
+          <w:t>8</w:t>
         </w:r>
         <w:r>
           <w:rPr>
@@ -1491,11 +1491,11 @@
           <w:kern w:val="2"/>
           <w:sz w:val="24"/>
           <w:szCs w:val="24"/>
-          <w:lang w:val="es-CO"/>
+          <w:lang w:val="es-419" w:eastAsia="es-419"/>
           <w14:ligatures w14:val="standardContextual"/>
         </w:rPr>
       </w:pPr>
-      <w:hyperlink w:anchor="_Toc242459449" w:history="1">
+      <w:hyperlink w:anchor="_Toc243049471" w:history="1">
         <w:r>
           <w:rPr>
             <w:rStyle w:val="Hipervnculo"/>
@@ -1522,7 +1522,7 @@
             <w:noProof/>
             <w:webHidden/>
           </w:rPr>
-          <w:instrText xml:space="preserve"> PAGEREF _Toc242459449 \h </w:instrText>
+          <w:instrText xml:space="preserve"> PAGEREF _Toc243049471 \h </w:instrText>
         </w:r>
         <w:r>
           <w:rPr>
@@ -1566,11 +1566,11 @@
           <w:kern w:val="2"/>
           <w:sz w:val="24"/>
           <w:szCs w:val="24"/>
-          <w:lang w:val="es-CO"/>
+          <w:lang w:val="es-419" w:eastAsia="es-419"/>
           <w14:ligatures w14:val="standardContextual"/>
         </w:rPr>
       </w:pPr>
-      <w:hyperlink w:anchor="_Toc242459450" w:history="1">
+      <w:hyperlink w:anchor="_Toc243049472" w:history="1">
         <w:r>
           <w:rPr>
             <w:rStyle w:val="Hipervnculo"/>
@@ -1597,7 +1597,7 @@
             <w:noProof/>
             <w:webHidden/>
           </w:rPr>
-          <w:instrText xml:space="preserve"> PAGEREF _Toc242459450 \h </w:instrText>
+          <w:instrText xml:space="preserve"> PAGEREF _Toc243049472 \h </w:instrText>
         </w:r>
         <w:r>
           <w:rPr>
@@ -1617,7 +1617,7 @@
             <w:noProof/>
             <w:webHidden/>
           </w:rPr>
-          <w:t>8</w:t>
+          <w:t>9</w:t>
         </w:r>
         <w:r>
           <w:rPr>
@@ -1641,11 +1641,11 @@
           <w:kern w:val="2"/>
           <w:sz w:val="24"/>
           <w:szCs w:val="24"/>
-          <w:lang w:val="es-CO"/>
+          <w:lang w:val="es-419" w:eastAsia="es-419"/>
           <w14:ligatures w14:val="standardContextual"/>
         </w:rPr>
       </w:pPr>
-      <w:hyperlink w:anchor="_Toc242459451" w:history="1">
+      <w:hyperlink w:anchor="_Toc243049473" w:history="1">
         <w:r>
           <w:rPr>
             <w:rStyle w:val="Hipervnculo"/>
@@ -1672,7 +1672,7 @@
             <w:noProof/>
             <w:webHidden/>
           </w:rPr>
-          <w:instrText xml:space="preserve"> PAGEREF _Toc242459451 \h </w:instrText>
+          <w:instrText xml:space="preserve"> PAGEREF _Toc243049473 \h </w:instrText>
         </w:r>
         <w:r>
           <w:rPr>
@@ -1692,7 +1692,7 @@
             <w:noProof/>
             <w:webHidden/>
           </w:rPr>
-          <w:t>9</w:t>
+          <w:t>10</w:t>
         </w:r>
         <w:r>
           <w:rPr>
@@ -1717,7 +1717,7 @@
       <w:pPr>
         <w:pStyle w:val="Ttulo1"/>
       </w:pPr>
-      <w:bookmarkStart w:id="0" w:name="_Toc242459436"/>
+      <w:bookmarkStart w:id="0" w:name="_Toc243049458"/>
       <w:r>
         <w:lastRenderedPageBreak/>
         <w:t>Introducción</w:t>
@@ -1744,7 +1744,7 @@
       <w:pPr>
         <w:pStyle w:val="Ttulo2"/>
       </w:pPr>
-      <w:bookmarkStart w:id="1" w:name="_Toc242459437"/>
+      <w:bookmarkStart w:id="1" w:name="_Toc243049459"/>
       <w:r>
         <w:t>Objetivos de las pruebas</w:t>
       </w:r>
@@ -1806,7 +1806,7 @@
       <w:pPr>
         <w:pStyle w:val="Ttulo1"/>
       </w:pPr>
-      <w:bookmarkStart w:id="2" w:name="_Toc242459438"/>
+      <w:bookmarkStart w:id="2" w:name="_Toc243049460"/>
       <w:r>
         <w:t>Estrategia de pruebas</w:t>
       </w:r>
@@ -1981,7 +1981,7 @@
               <w:pStyle w:val="APACelda"/>
             </w:pPr>
             <w:r>
-              <w:t>node:test (Node.js 20)</w:t>
+              <w:t>node:test (backend); Jest + jest-expo (frontend)</w:t>
             </w:r>
           </w:p>
         </w:tc>
@@ -2358,7 +2358,7 @@
       <w:pPr>
         <w:pStyle w:val="Ttulo1"/>
       </w:pPr>
-      <w:bookmarkStart w:id="3" w:name="_Toc242459439"/>
+      <w:bookmarkStart w:id="3" w:name="_Toc243049461"/>
       <w:r>
         <w:t>Plan de pruebas</w:t>
       </w:r>
@@ -2368,7 +2368,7 @@
       <w:pPr>
         <w:pStyle w:val="Ttulo2"/>
       </w:pPr>
-      <w:bookmarkStart w:id="4" w:name="_Toc242459440"/>
+      <w:bookmarkStart w:id="4" w:name="_Toc243049462"/>
       <w:r>
         <w:t>Elementos a probar</w:t>
       </w:r>
@@ -2384,7 +2384,7 @@
         <w:spacing w:line="360" w:lineRule="auto"/>
       </w:pPr>
       <w:r>
-        <w:t>api-gateway y los cinco microservicios (rama feat/microservices-split, commit 5a91e66).</w:t>
+        <w:t>api-gateway y los cinco microservicios (rama develop, commit 2993301).</w:t>
       </w:r>
     </w:p>
     <w:p>
@@ -2410,14 +2410,14 @@
         <w:spacing w:line="360" w:lineRule="auto"/>
       </w:pPr>
       <w:r>
-        <w:t>Aplicación cliente en Android y en navegador de escritorio.</w:t>
+        <w:t>Aplicación cliente en Android y en navegador de escritorio, con pruebas unitarias de su lógica: validaciones, cliente de la API, flujos de autenticación y reconocimiento (rama chore/frontend-unit-tests).</w:t>
       </w:r>
     </w:p>
     <w:p>
       <w:pPr>
         <w:pStyle w:val="Ttulo2"/>
       </w:pPr>
-      <w:bookmarkStart w:id="5" w:name="_Toc242459441"/>
+      <w:bookmarkStart w:id="5" w:name="_Toc243049463"/>
       <w:r>
         <w:t>Elementos fuera de alcance de esta iteración</w:t>
       </w:r>
@@ -2433,7 +2433,7 @@
         <w:spacing w:line="360" w:lineRule="auto"/>
       </w:pPr>
       <w:r>
-        <w:t>Pruebas de carga sobre un servidor de producción (no existe aún).</w:t>
+        <w:t>Pruebas de carga sobre el servidor de producción (traducesenas.tech), para no afectar a los usuarios.</w:t>
       </w:r>
     </w:p>
     <w:p>
@@ -2466,7 +2466,7 @@
       <w:pPr>
         <w:pStyle w:val="Ttulo2"/>
       </w:pPr>
-      <w:bookmarkStart w:id="6" w:name="_Toc242459442"/>
+      <w:bookmarkStart w:id="6" w:name="_Toc243049464"/>
       <w:r>
         <w:t>Entorno de pruebas</w:t>
       </w:r>
@@ -2697,7 +2697,7 @@
       <w:pPr>
         <w:pStyle w:val="Ttulo2"/>
       </w:pPr>
-      <w:bookmarkStart w:id="7" w:name="_Toc242459443"/>
+      <w:bookmarkStart w:id="7" w:name="_Toc243049465"/>
       <w:r>
         <w:t>Criterios de aceptación y suspensión</w:t>
       </w:r>
@@ -2738,7 +2738,11 @@
         <w:t>Suspensión:</w:t>
       </w:r>
       <w:r>
-        <w:t xml:space="preserve"> se detiene la ejecución si falla la compilación o si una prueba crítica de seguridad falla.</w:t>
+        <w:t xml:space="preserve"> se detiene la ejecución si falla la compilación o si una prueba crítica de </w:t>
+      </w:r>
+      <w:r>
+        <w:lastRenderedPageBreak/>
+        <w:t>seguridad falla.</w:t>
       </w:r>
     </w:p>
     <w:p>
@@ -2764,9 +2768,8 @@
       <w:pPr>
         <w:pStyle w:val="Ttulo2"/>
       </w:pPr>
-      <w:bookmarkStart w:id="8" w:name="_Toc242459444"/>
+      <w:bookmarkStart w:id="8" w:name="_Toc243049466"/>
       <w:r>
-        <w:lastRenderedPageBreak/>
         <w:t>Roles</w:t>
       </w:r>
       <w:bookmarkEnd w:id="8"/>
@@ -3020,7 +3023,7 @@
       <w:pPr>
         <w:pStyle w:val="Ttulo1"/>
       </w:pPr>
-      <w:bookmarkStart w:id="9" w:name="_Toc242459445"/>
+      <w:bookmarkStart w:id="9" w:name="_Toc243049467"/>
       <w:r>
         <w:t>Resultados de las pruebas automatizadas</w:t>
       </w:r>
@@ -3031,7 +3034,7 @@
         <w:pStyle w:val="APATexto"/>
       </w:pPr>
       <w:r>
-        <w:t>La suite automatizada del backend se ejecutó con «npm test», que compila el paquete compartido y corre las pruebas de todos los servicios con el ejecutor nativo de Node.js. El resultado fue el siguiente:</w:t>
+        <w:t>Las suites automatizadas se ejecutaron con «npm test» en cada repositorio. En el backend, el comando compila el paquete compartido y corre las pruebas de todos los servicios con el ejecutor nativo de Node.js; en el frontend, corre Jest con el preset de Expo (jest-expo). El resultado fue el siguiente:</w:t>
       </w:r>
     </w:p>
     <w:p>
@@ -3059,13 +3062,13 @@
         <w:rPr>
           <w:i/>
         </w:rPr>
-        <w:t>Resumen de la ejecución automatizada del 7 de octubre de 2026</w:t>
+        <w:t>Resumen de la ejecución automatizada del 16 de octubre de 2026</w:t>
       </w:r>
     </w:p>
     <w:tbl>
       <w:tblPr>
         <w:tblStyle w:val="Tablaconcuadrcula"/>
-        <w:tblW w:w="0" w:type="auto"/>
+        <w:tblW w:w="5005" w:type="pct"/>
         <w:jc w:val="center"/>
         <w:tblInd w:w="0" w:type="dxa"/>
         <w:tblBorders>
@@ -3076,11 +3079,13 @@
           <w:insideH w:val="single" w:sz="4" w:space="0" w:color="000000"/>
           <w:insideV w:val="single" w:sz="4" w:space="0" w:color="000000"/>
         </w:tblBorders>
+        <w:tblLayout w:type="fixed"/>
         <w:tblLook w:val="04A0" w:firstRow="1" w:lastRow="0" w:firstColumn="1" w:lastColumn="0" w:noHBand="0" w:noVBand="1"/>
       </w:tblPr>
       <w:tblGrid>
-        <w:gridCol w:w="4535"/>
-        <w:gridCol w:w="4535"/>
+        <w:gridCol w:w="3743"/>
+        <w:gridCol w:w="2808"/>
+        <w:gridCol w:w="2808"/>
       </w:tblGrid>
       <w:tr>
         <w:trPr>
@@ -3090,7 +3095,7 @@
         </w:trPr>
         <w:tc>
           <w:tcPr>
-            <w:tcW w:w="4535" w:type="dxa"/>
+            <w:tcW w:w="2000" w:type="pct"/>
           </w:tcPr>
           <w:p>
             <w:pPr>
@@ -3106,7 +3111,7 @@
         </w:tc>
         <w:tc>
           <w:tcPr>
-            <w:tcW w:w="4535" w:type="dxa"/>
+            <w:tcW w:w="1500" w:type="pct"/>
           </w:tcPr>
           <w:p>
             <w:pPr>
@@ -3116,7 +3121,26 @@
               <w:rPr>
                 <w:b/>
               </w:rPr>
-              <w:t>Valor</w:t>
+              <w:t>Backend</w:t>
+            </w:r>
+          </w:p>
+        </w:tc>
+        <w:tc>
+          <w:tcPr>
+            <w:tcW w:w="1500" w:type="pct"/>
+          </w:tcPr>
+          <w:p>
+            <w:pPr>
+              <w:pStyle w:val="APACelda"/>
+              <w:rPr>
+                <w:b/>
+              </w:rPr>
+            </w:pPr>
+            <w:r>
+              <w:rPr>
+                <w:b/>
+              </w:rPr>
+              <w:t>Frontend</w:t>
             </w:r>
           </w:p>
         </w:tc>
@@ -3128,7 +3152,7 @@
         </w:trPr>
         <w:tc>
           <w:tcPr>
-            <w:tcW w:w="4535" w:type="dxa"/>
+            <w:tcW w:w="2000" w:type="pct"/>
           </w:tcPr>
           <w:p>
             <w:pPr>
@@ -3141,14 +3165,27 @@
         </w:tc>
         <w:tc>
           <w:tcPr>
-            <w:tcW w:w="4535" w:type="dxa"/>
-          </w:tcPr>
-          <w:p>
-            <w:pPr>
-              <w:pStyle w:val="APACelda"/>
-            </w:pPr>
-            <w:r>
-              <w:t>494</w:t>
+            <w:tcW w:w="1500" w:type="pct"/>
+          </w:tcPr>
+          <w:p>
+            <w:pPr>
+              <w:pStyle w:val="APACelda"/>
+            </w:pPr>
+            <w:r>
+              <w:t>683</w:t>
+            </w:r>
+          </w:p>
+        </w:tc>
+        <w:tc>
+          <w:tcPr>
+            <w:tcW w:w="1500" w:type="pct"/>
+          </w:tcPr>
+          <w:p>
+            <w:pPr>
+              <w:pStyle w:val="APACelda"/>
+            </w:pPr>
+            <w:r>
+              <w:t>79</w:t>
             </w:r>
           </w:p>
         </w:tc>
@@ -3160,7 +3197,7 @@
         </w:trPr>
         <w:tc>
           <w:tcPr>
-            <w:tcW w:w="4535" w:type="dxa"/>
+            <w:tcW w:w="2000" w:type="pct"/>
           </w:tcPr>
           <w:p>
             <w:pPr>
@@ -3173,14 +3210,27 @@
         </w:tc>
         <w:tc>
           <w:tcPr>
-            <w:tcW w:w="4535" w:type="dxa"/>
-          </w:tcPr>
-          <w:p>
-            <w:pPr>
-              <w:pStyle w:val="APACelda"/>
-            </w:pPr>
-            <w:r>
-              <w:t>115</w:t>
+            <w:tcW w:w="1500" w:type="pct"/>
+          </w:tcPr>
+          <w:p>
+            <w:pPr>
+              <w:pStyle w:val="APACelda"/>
+            </w:pPr>
+            <w:r>
+              <w:t>141</w:t>
+            </w:r>
+          </w:p>
+        </w:tc>
+        <w:tc>
+          <w:tcPr>
+            <w:tcW w:w="1500" w:type="pct"/>
+          </w:tcPr>
+          <w:p>
+            <w:pPr>
+              <w:pStyle w:val="APACelda"/>
+            </w:pPr>
+            <w:r>
+              <w:t>8</w:t>
             </w:r>
           </w:p>
         </w:tc>
@@ -3192,7 +3242,7 @@
         </w:trPr>
         <w:tc>
           <w:tcPr>
-            <w:tcW w:w="4535" w:type="dxa"/>
+            <w:tcW w:w="2000" w:type="pct"/>
           </w:tcPr>
           <w:p>
             <w:pPr>
@@ -3205,14 +3255,27 @@
         </w:tc>
         <w:tc>
           <w:tcPr>
-            <w:tcW w:w="4535" w:type="dxa"/>
-          </w:tcPr>
-          <w:p>
-            <w:pPr>
-              <w:pStyle w:val="APACelda"/>
-            </w:pPr>
-            <w:r>
-              <w:t>494</w:t>
+            <w:tcW w:w="1500" w:type="pct"/>
+          </w:tcPr>
+          <w:p>
+            <w:pPr>
+              <w:pStyle w:val="APACelda"/>
+            </w:pPr>
+            <w:r>
+              <w:t>681</w:t>
+            </w:r>
+          </w:p>
+        </w:tc>
+        <w:tc>
+          <w:tcPr>
+            <w:tcW w:w="1500" w:type="pct"/>
+          </w:tcPr>
+          <w:p>
+            <w:pPr>
+              <w:pStyle w:val="APACelda"/>
+            </w:pPr>
+            <w:r>
+              <w:t>79</w:t>
             </w:r>
           </w:p>
         </w:tc>
@@ -3224,7 +3287,7 @@
         </w:trPr>
         <w:tc>
           <w:tcPr>
-            <w:tcW w:w="4535" w:type="dxa"/>
+            <w:tcW w:w="2000" w:type="pct"/>
           </w:tcPr>
           <w:p>
             <w:pPr>
@@ -3237,7 +3300,20 @@
         </w:tc>
         <w:tc>
           <w:tcPr>
-            <w:tcW w:w="4535" w:type="dxa"/>
+            <w:tcW w:w="1500" w:type="pct"/>
+          </w:tcPr>
+          <w:p>
+            <w:pPr>
+              <w:pStyle w:val="APACelda"/>
+            </w:pPr>
+            <w:r>
+              <w:t>0</w:t>
+            </w:r>
+          </w:p>
+        </w:tc>
+        <w:tc>
+          <w:tcPr>
+            <w:tcW w:w="1500" w:type="pct"/>
           </w:tcPr>
           <w:p>
             <w:pPr>
@@ -3256,7 +3332,7 @@
         </w:trPr>
         <w:tc>
           <w:tcPr>
-            <w:tcW w:w="4535" w:type="dxa"/>
+            <w:tcW w:w="2000" w:type="pct"/>
           </w:tcPr>
           <w:p>
             <w:pPr>
@@ -3269,7 +3345,20 @@
         </w:tc>
         <w:tc>
           <w:tcPr>
-            <w:tcW w:w="4535" w:type="dxa"/>
+            <w:tcW w:w="1500" w:type="pct"/>
+          </w:tcPr>
+          <w:p>
+            <w:pPr>
+              <w:pStyle w:val="APACelda"/>
+            </w:pPr>
+            <w:r>
+              <w:t>2 / 0</w:t>
+            </w:r>
+          </w:p>
+        </w:tc>
+        <w:tc>
+          <w:tcPr>
+            <w:tcW w:w="1500" w:type="pct"/>
           </w:tcPr>
           <w:p>
             <w:pPr>
@@ -3288,7 +3377,7 @@
         </w:trPr>
         <w:tc>
           <w:tcPr>
-            <w:tcW w:w="4535" w:type="dxa"/>
+            <w:tcW w:w="2000" w:type="pct"/>
           </w:tcPr>
           <w:p>
             <w:pPr>
@@ -3301,14 +3390,27 @@
         </w:tc>
         <w:tc>
           <w:tcPr>
-            <w:tcW w:w="4535" w:type="dxa"/>
-          </w:tcPr>
-          <w:p>
-            <w:pPr>
-              <w:pStyle w:val="APACelda"/>
-            </w:pPr>
-            <w:r>
-              <w:t>87 segundos</w:t>
+            <w:tcW w:w="1500" w:type="pct"/>
+          </w:tcPr>
+          <w:p>
+            <w:pPr>
+              <w:pStyle w:val="APACelda"/>
+            </w:pPr>
+            <w:r>
+              <w:t>22 segundos</w:t>
+            </w:r>
+          </w:p>
+        </w:tc>
+        <w:tc>
+          <w:tcPr>
+            <w:tcW w:w="1500" w:type="pct"/>
+          </w:tcPr>
+          <w:p>
+            <w:pPr>
+              <w:pStyle w:val="APACelda"/>
+            </w:pPr>
+            <w:r>
+              <w:t>3 segundos</w:t>
             </w:r>
           </w:p>
         </w:tc>
@@ -3331,7 +3433,7 @@
         <w:rPr>
           <w:sz w:val="20"/>
         </w:rPr>
-        <w:t xml:space="preserve"> Salida de «npm test» en la rama feat/microservices-split, commit 5a91e66.</w:t>
+        <w:t xml:space="preserve"> Backend: rama develop, commit 2993301; las 2 pruebas omitidas necesitan una base PostgreSQL de prueba (variable PROFILE_TEST_DATABASE_URL). Frontend: rama chore/frontend-unit-tests, commit 6219c0d.</w:t>
       </w:r>
     </w:p>
     <w:p>
@@ -3365,7 +3467,7 @@
     <w:tbl>
       <w:tblPr>
         <w:tblStyle w:val="Tablaconcuadrcula"/>
-        <w:tblW w:w="0" w:type="auto"/>
+        <w:tblW w:w="5005" w:type="pct"/>
         <w:jc w:val="center"/>
         <w:tblInd w:w="0" w:type="dxa"/>
         <w:tblBorders>
@@ -3376,12 +3478,14 @@
           <w:insideH w:val="single" w:sz="4" w:space="0" w:color="000000"/>
           <w:insideV w:val="single" w:sz="4" w:space="0" w:color="000000"/>
         </w:tblBorders>
+        <w:tblLayout w:type="fixed"/>
         <w:tblLook w:val="04A0" w:firstRow="1" w:lastRow="0" w:firstColumn="1" w:lastColumn="0" w:noHBand="0" w:noVBand="1"/>
       </w:tblPr>
       <w:tblGrid>
-        <w:gridCol w:w="1928"/>
-        <w:gridCol w:w="1474"/>
-        <w:gridCol w:w="5669"/>
+        <w:gridCol w:w="1685"/>
+        <w:gridCol w:w="1310"/>
+        <w:gridCol w:w="4867"/>
+        <w:gridCol w:w="1497"/>
       </w:tblGrid>
       <w:tr>
         <w:trPr>
@@ -3391,7 +3495,7 @@
         </w:trPr>
         <w:tc>
           <w:tcPr>
-            <w:tcW w:w="1928" w:type="dxa"/>
+            <w:tcW w:w="900" w:type="pct"/>
           </w:tcPr>
           <w:p>
             <w:pPr>
@@ -3407,7 +3511,7 @@
         </w:tc>
         <w:tc>
           <w:tcPr>
-            <w:tcW w:w="1474" w:type="dxa"/>
+            <w:tcW w:w="700" w:type="pct"/>
           </w:tcPr>
           <w:p>
             <w:pPr>
@@ -3423,7 +3527,7 @@
         </w:tc>
         <w:tc>
           <w:tcPr>
-            <w:tcW w:w="5669" w:type="dxa"/>
+            <w:tcW w:w="2600" w:type="pct"/>
           </w:tcPr>
           <w:p>
             <w:pPr>
@@ -3434,6 +3538,25 @@
                 <w:b/>
               </w:rPr>
               <w:t>Aspectos verificados</w:t>
+            </w:r>
+          </w:p>
+        </w:tc>
+        <w:tc>
+          <w:tcPr>
+            <w:tcW w:w="800" w:type="pct"/>
+          </w:tcPr>
+          <w:p>
+            <w:pPr>
+              <w:pStyle w:val="APACelda"/>
+              <w:rPr>
+                <w:b/>
+              </w:rPr>
+            </w:pPr>
+            <w:r>
+              <w:rPr>
+                <w:b/>
+              </w:rPr>
+              <w:t>Cobertura de líneas</w:t>
             </w:r>
           </w:p>
         </w:tc>
@@ -3445,7 +3568,7 @@
         </w:trPr>
         <w:tc>
           <w:tcPr>
-            <w:tcW w:w="1928" w:type="dxa"/>
+            <w:tcW w:w="900" w:type="pct"/>
           </w:tcPr>
           <w:p>
             <w:pPr>
@@ -3458,7 +3581,7 @@
         </w:tc>
         <w:tc>
           <w:tcPr>
-            <w:tcW w:w="1474" w:type="dxa"/>
+            <w:tcW w:w="700" w:type="pct"/>
           </w:tcPr>
           <w:p>
             <w:pPr>
@@ -3471,7 +3594,7 @@
         </w:tc>
         <w:tc>
           <w:tcPr>
-            <w:tcW w:w="5669" w:type="dxa"/>
+            <w:tcW w:w="2600" w:type="pct"/>
           </w:tcPr>
           <w:p>
             <w:pPr>
@@ -3479,6 +3602,19 @@
             </w:pPr>
             <w:r>
               <w:t>Proveedor JWT, authMiddleware, requireRole, requirePermission, manejador de errores, configuración, validadores de eventos, reintento exponencial, bus en memoria y RabbitMQ</w:t>
+            </w:r>
+          </w:p>
+        </w:tc>
+        <w:tc>
+          <w:tcPr>
+            <w:tcW w:w="800" w:type="pct"/>
+          </w:tcPr>
+          <w:p>
+            <w:pPr>
+              <w:pStyle w:val="APACelda"/>
+            </w:pPr>
+            <w:r>
+              <w:t>99,5 %</w:t>
             </w:r>
           </w:p>
         </w:tc>
@@ -3490,7 +3626,7 @@
         </w:trPr>
         <w:tc>
           <w:tcPr>
-            <w:tcW w:w="1928" w:type="dxa"/>
+            <w:tcW w:w="900" w:type="pct"/>
           </w:tcPr>
           <w:p>
             <w:pPr>
@@ -3503,7 +3639,7 @@
         </w:tc>
         <w:tc>
           <w:tcPr>
-            <w:tcW w:w="1474" w:type="dxa"/>
+            <w:tcW w:w="700" w:type="pct"/>
           </w:tcPr>
           <w:p>
             <w:pPr>
@@ -3516,14 +3652,31 @@
         </w:tc>
         <w:tc>
           <w:tcPr>
-            <w:tcW w:w="5669" w:type="dxa"/>
-          </w:tcPr>
-          <w:p>
-            <w:pPr>
-              <w:pStyle w:val="APACelda"/>
-            </w:pPr>
-            <w:r>
-              <w:t>Enrutamiento por prefijo, CORS con lista blanca, configuración, rutas públicas</w:t>
+            <w:tcW w:w="2600" w:type="pct"/>
+          </w:tcPr>
+          <w:p>
+            <w:pPr>
+              <w:pStyle w:val="APACelda"/>
+            </w:pPr>
+            <w:r>
+              <w:t>Enrutamiento por pre</w:t>
+            </w:r>
+            <w:r>
+              <w:lastRenderedPageBreak/>
+              <w:t>fijo, CORS con lista blanca, configuración, rutas públicas, límite de peticiones</w:t>
+            </w:r>
+          </w:p>
+        </w:tc>
+        <w:tc>
+          <w:tcPr>
+            <w:tcW w:w="800" w:type="pct"/>
+          </w:tcPr>
+          <w:p>
+            <w:pPr>
+              <w:pStyle w:val="APACelda"/>
+            </w:pPr>
+            <w:r>
+              <w:t>100 %</w:t>
             </w:r>
           </w:p>
         </w:tc>
@@ -3535,7 +3688,7 @@
         </w:trPr>
         <w:tc>
           <w:tcPr>
-            <w:tcW w:w="1928" w:type="dxa"/>
+            <w:tcW w:w="900" w:type="pct"/>
           </w:tcPr>
           <w:p>
             <w:pPr>
@@ -3548,27 +3701,40 @@
         </w:tc>
         <w:tc>
           <w:tcPr>
-            <w:tcW w:w="1474" w:type="dxa"/>
-          </w:tcPr>
-          <w:p>
-            <w:pPr>
-              <w:pStyle w:val="APACelda"/>
-            </w:pPr>
-            <w:r>
-              <w:t>22</w:t>
-            </w:r>
-          </w:p>
-        </w:tc>
-        <w:tc>
-          <w:tcPr>
-            <w:tcW w:w="5669" w:type="dxa"/>
-          </w:tcPr>
-          <w:p>
-            <w:pPr>
-              <w:pStyle w:val="APACelda"/>
-            </w:pPr>
-            <w:r>
-              <w:t>Registro con verificación de correo, inicio de sesión según estado, recuperación de contraseña, JWT con roles y permisos, cambio y borrado de cuenta, plantillas de correo</w:t>
+            <w:tcW w:w="700" w:type="pct"/>
+          </w:tcPr>
+          <w:p>
+            <w:pPr>
+              <w:pStyle w:val="APACelda"/>
+            </w:pPr>
+            <w:r>
+              <w:t>30</w:t>
+            </w:r>
+          </w:p>
+        </w:tc>
+        <w:tc>
+          <w:tcPr>
+            <w:tcW w:w="2600" w:type="pct"/>
+          </w:tcPr>
+          <w:p>
+            <w:pPr>
+              <w:pStyle w:val="APACelda"/>
+            </w:pPr>
+            <w:r>
+              <w:t>Registro con verificación de correo, inicio de sesión según estado y con Google o Facebook, recuperación de contraseña, JWT con roles y permisos, cambio y borrado de cuenta (también con código por correo), envío de eventos con outbox, plantillas de correo</w:t>
+            </w:r>
+          </w:p>
+        </w:tc>
+        <w:tc>
+          <w:tcPr>
+            <w:tcW w:w="800" w:type="pct"/>
+          </w:tcPr>
+          <w:p>
+            <w:pPr>
+              <w:pStyle w:val="APACelda"/>
+            </w:pPr>
+            <w:r>
+              <w:t>89,3 %</w:t>
             </w:r>
           </w:p>
         </w:tc>
@@ -3580,7 +3746,7 @@
         </w:trPr>
         <w:tc>
           <w:tcPr>
-            <w:tcW w:w="1928" w:type="dxa"/>
+            <w:tcW w:w="900" w:type="pct"/>
           </w:tcPr>
           <w:p>
             <w:pPr>
@@ -3593,27 +3759,40 @@
         </w:tc>
         <w:tc>
           <w:tcPr>
-            <w:tcW w:w="1474" w:type="dxa"/>
-          </w:tcPr>
-          <w:p>
-            <w:pPr>
-              <w:pStyle w:val="APACelda"/>
-            </w:pPr>
-            <w:r>
-              <w:t>11</w:t>
-            </w:r>
-          </w:p>
-        </w:tc>
-        <w:tc>
-          <w:tcPr>
-            <w:tcW w:w="5669" w:type="dxa"/>
-          </w:tcPr>
-          <w:p>
-            <w:pPr>
-              <w:pStyle w:val="APACelda"/>
-            </w:pPr>
-            <w:r>
-              <w:t>Traducciones, historial, plantillas de señas (solo ADMIN), muestras y consumo de eventos de lexicon con contrato</w:t>
+            <w:tcW w:w="700" w:type="pct"/>
+          </w:tcPr>
+          <w:p>
+            <w:pPr>
+              <w:pStyle w:val="APACelda"/>
+            </w:pPr>
+            <w:r>
+              <w:t>13</w:t>
+            </w:r>
+          </w:p>
+        </w:tc>
+        <w:tc>
+          <w:tcPr>
+            <w:tcW w:w="2600" w:type="pct"/>
+          </w:tcPr>
+          <w:p>
+            <w:pPr>
+              <w:pStyle w:val="APACelda"/>
+            </w:pPr>
+            <w:r>
+              <w:t>Traducciones, historial, plantillas de señas (solo ADMIN), muestras, consumo de eventos de lexicon con contrato y rechazo de escrituras de cuentas eliminadas</w:t>
+            </w:r>
+          </w:p>
+        </w:tc>
+        <w:tc>
+          <w:tcPr>
+            <w:tcW w:w="800" w:type="pct"/>
+          </w:tcPr>
+          <w:p>
+            <w:pPr>
+              <w:pStyle w:val="APACelda"/>
+            </w:pPr>
+            <w:r>
+              <w:t>86,0 %</w:t>
             </w:r>
           </w:p>
         </w:tc>
@@ -3625,7 +3804,7 @@
         </w:trPr>
         <w:tc>
           <w:tcPr>
-            <w:tcW w:w="1928" w:type="dxa"/>
+            <w:tcW w:w="900" w:type="pct"/>
           </w:tcPr>
           <w:p>
             <w:pPr>
@@ -3638,20 +3817,20 @@
         </w:tc>
         <w:tc>
           <w:tcPr>
-            <w:tcW w:w="1474" w:type="dxa"/>
-          </w:tcPr>
-          <w:p>
-            <w:pPr>
-              <w:pStyle w:val="APACelda"/>
-            </w:pPr>
-            <w:r>
-              <w:t>6</w:t>
-            </w:r>
-          </w:p>
-        </w:tc>
-        <w:tc>
-          <w:tcPr>
-            <w:tcW w:w="5669" w:type="dxa"/>
+            <w:tcW w:w="700" w:type="pct"/>
+          </w:tcPr>
+          <w:p>
+            <w:pPr>
+              <w:pStyle w:val="APACelda"/>
+            </w:pPr>
+            <w:r>
+              <w:t>5</w:t>
+            </w:r>
+          </w:p>
+        </w:tc>
+        <w:tc>
+          <w:tcPr>
+            <w:tcW w:w="2600" w:type="pct"/>
           </w:tcPr>
           <w:p>
             <w:pPr>
@@ -3659,6 +3838,19 @@
             </w:pPr>
             <w:r>
               <w:t>Catálogo, alfabeto, búsqueda, categorías, publicación y retiro de señas</w:t>
+            </w:r>
+          </w:p>
+        </w:tc>
+        <w:tc>
+          <w:tcPr>
+            <w:tcW w:w="800" w:type="pct"/>
+          </w:tcPr>
+          <w:p>
+            <w:pPr>
+              <w:pStyle w:val="APACelda"/>
+            </w:pPr>
+            <w:r>
+              <w:t>83,5 %</w:t>
             </w:r>
           </w:p>
         </w:tc>
@@ -3670,7 +3862,7 @@
         </w:trPr>
         <w:tc>
           <w:tcPr>
-            <w:tcW w:w="1928" w:type="dxa"/>
+            <w:tcW w:w="900" w:type="pct"/>
           </w:tcPr>
           <w:p>
             <w:pPr>
@@ -3683,27 +3875,40 @@
         </w:tc>
         <w:tc>
           <w:tcPr>
-            <w:tcW w:w="1474" w:type="dxa"/>
-          </w:tcPr>
-          <w:p>
-            <w:pPr>
-              <w:pStyle w:val="APACelda"/>
-            </w:pPr>
-            <w:r>
-              <w:t>4</w:t>
-            </w:r>
-          </w:p>
-        </w:tc>
-        <w:tc>
-          <w:tcPr>
-            <w:tcW w:w="5669" w:type="dxa"/>
-          </w:tcPr>
-          <w:p>
-            <w:pPr>
-              <w:pStyle w:val="APACelda"/>
-            </w:pPr>
-            <w:r>
-              <w:t>Registro de eventos, reportes y manejadores de eventos</w:t>
+            <w:tcW w:w="700" w:type="pct"/>
+          </w:tcPr>
+          <w:p>
+            <w:pPr>
+              <w:pStyle w:val="APACelda"/>
+            </w:pPr>
+            <w:r>
+              <w:t>6</w:t>
+            </w:r>
+          </w:p>
+        </w:tc>
+        <w:tc>
+          <w:tcPr>
+            <w:tcW w:w="2600" w:type="pct"/>
+          </w:tcPr>
+          <w:p>
+            <w:pPr>
+              <w:pStyle w:val="APACelda"/>
+            </w:pPr>
+            <w:r>
+              <w:t>Registro de eventos, reportes, manejadores de eventos y borrado atómico de los datos de una cuenta</w:t>
+            </w:r>
+          </w:p>
+        </w:tc>
+        <w:tc>
+          <w:tcPr>
+            <w:tcW w:w="800" w:type="pct"/>
+          </w:tcPr>
+          <w:p>
+            <w:pPr>
+              <w:pStyle w:val="APACelda"/>
+            </w:pPr>
+            <w:r>
+              <w:t>95,1 %</w:t>
             </w:r>
           </w:p>
         </w:tc>
@@ -3715,7 +3920,7 @@
         </w:trPr>
         <w:tc>
           <w:tcPr>
-            <w:tcW w:w="1928" w:type="dxa"/>
+            <w:tcW w:w="900" w:type="pct"/>
           </w:tcPr>
           <w:p>
             <w:pPr>
@@ -3728,27 +3933,98 @@
         </w:tc>
         <w:tc>
           <w:tcPr>
-            <w:tcW w:w="1474" w:type="dxa"/>
-          </w:tcPr>
-          <w:p>
-            <w:pPr>
-              <w:pStyle w:val="APACelda"/>
-            </w:pPr>
-            <w:r>
-              <w:t>4</w:t>
-            </w:r>
-          </w:p>
-        </w:tc>
-        <w:tc>
-          <w:tcPr>
-            <w:tcW w:w="5669" w:type="dxa"/>
-          </w:tcPr>
-          <w:p>
-            <w:pPr>
-              <w:pStyle w:val="APACelda"/>
-            </w:pPr>
-            <w:r>
-              <w:t>Perfil, preferencias, notificaciones y logros</w:t>
+            <w:tcW w:w="700" w:type="pct"/>
+          </w:tcPr>
+          <w:p>
+            <w:pPr>
+              <w:pStyle w:val="APACelda"/>
+            </w:pPr>
+            <w:r>
+              <w:t>11</w:t>
+            </w:r>
+          </w:p>
+        </w:tc>
+        <w:tc>
+          <w:tcPr>
+            <w:tcW w:w="2600" w:type="pct"/>
+          </w:tcPr>
+          <w:p>
+            <w:pPr>
+              <w:pStyle w:val="APACelda"/>
+            </w:pPr>
+            <w:r>
+              <w:t>Perfil, preferencias con permisos y creación del perfil faltante, notificaciones, logros con actualizaciones simultáneas, borrado de cuenta y recuperación de perfiles</w:t>
+            </w:r>
+          </w:p>
+        </w:tc>
+        <w:tc>
+          <w:tcPr>
+            <w:tcW w:w="800" w:type="pct"/>
+          </w:tcPr>
+          <w:p>
+            <w:pPr>
+              <w:pStyle w:val="APACelda"/>
+            </w:pPr>
+            <w:r>
+              <w:t>83,5 %</w:t>
+            </w:r>
+          </w:p>
+        </w:tc>
+      </w:tr>
+      <w:tr>
+        <w:trPr>
+          <w:cantSplit/>
+          <w:jc w:val="center"/>
+        </w:trPr>
+        <w:tc>
+          <w:tcPr>
+            <w:tcW w:w="900" w:type="pct"/>
+          </w:tcPr>
+          <w:p>
+            <w:pPr>
+              <w:pStyle w:val="APACelda"/>
+            </w:pPr>
+            <w:r>
+              <w:t>Frontend (aplicación cliente)</w:t>
+            </w:r>
+          </w:p>
+        </w:tc>
+        <w:tc>
+          <w:tcPr>
+            <w:tcW w:w="700" w:type="pct"/>
+          </w:tcPr>
+          <w:p>
+            <w:pPr>
+              <w:pStyle w:val="APACelda"/>
+            </w:pPr>
+            <w:r>
+              <w:t>8</w:t>
+            </w:r>
+          </w:p>
+        </w:tc>
+        <w:tc>
+          <w:tcPr>
+            <w:tcW w:w="2600" w:type="pct"/>
+          </w:tcPr>
+          <w:p>
+            <w:pPr>
+              <w:pStyle w:val="APACelda"/>
+            </w:pPr>
+            <w:r>
+              <w:t>Validación de correo y contraseña, cliente de la API (errores, token enviado solo a la API, aviso único de sesión caducada), flujos de confirmar correo y recuperar contraseña, contador de reenvío, normalización de la mano y clasificador KNN</w:t>
+            </w:r>
+          </w:p>
+        </w:tc>
+        <w:tc>
+          <w:tcPr>
+            <w:tcW w:w="800" w:type="pct"/>
+          </w:tcPr>
+          <w:p>
+            <w:pPr>
+              <w:pStyle w:val="APACelda"/>
+            </w:pPr>
+            <w:r>
+              <w:t>4,5 %</w:t>
             </w:r>
           </w:p>
         </w:tc>
@@ -3756,6 +4032,26 @@
     </w:tbl>
     <w:p>
       <w:pPr>
+        <w:pStyle w:val="APATexto"/>
+        <w:spacing w:before="80" w:after="200" w:line="240" w:lineRule="auto"/>
+        <w:ind w:firstLine="0"/>
+      </w:pPr>
+      <w:r>
+        <w:rPr>
+          <w:i/>
+          <w:sz w:val="20"/>
+        </w:rPr>
+        <w:t>Nota.</w:t>
+      </w:r>
+      <w:r>
+        <w:rPr>
+          <w:sz w:val="20"/>
+        </w:rPr>
+        <w:t xml:space="preserve"> Cobertura de líneas medida el 16 de octubre de 2026 con la cobertura integrada de node:test en el backend (total 88,5 %) y con «jest --coverage» en el frontend. En el frontend solo se prueba la lógica; las pantallas aún no tienen pruebas.</w:t>
+      </w:r>
+    </w:p>
+    <w:p>
+      <w:pPr>
         <w:spacing w:after="80"/>
       </w:pPr>
     </w:p>
@@ -3763,9 +4059,8 @@
       <w:pPr>
         <w:pStyle w:val="Ttulo1"/>
       </w:pPr>
-      <w:bookmarkStart w:id="10" w:name="_Toc242459446"/>
+      <w:bookmarkStart w:id="10" w:name="_Toc243049468"/>
       <w:r>
-        <w:lastRenderedPageBreak/>
         <w:t>Casos de prueba funcionales</w:t>
       </w:r>
       <w:bookmarkEnd w:id="10"/>
@@ -4619,6 +4914,7 @@
               <w:pStyle w:val="APACelda"/>
             </w:pPr>
             <w:r>
+              <w:lastRenderedPageBreak/>
               <w:t>CP-09</w:t>
             </w:r>
           </w:p>
@@ -4955,7 +5251,6 @@
               <w:pStyle w:val="APACelda"/>
             </w:pPr>
             <w:r>
-              <w:lastRenderedPageBreak/>
               <w:t>CP-13</w:t>
             </w:r>
           </w:p>
@@ -5303,7 +5598,7 @@
       <w:pPr>
         <w:pStyle w:val="Ttulo1"/>
       </w:pPr>
-      <w:bookmarkStart w:id="11" w:name="_Toc242459447"/>
+      <w:bookmarkStart w:id="11" w:name="_Toc243049469"/>
       <w:r>
         <w:t>Pruebas no funcionales</w:t>
       </w:r>
@@ -5846,8 +6141,9 @@
       <w:pPr>
         <w:pStyle w:val="Ttulo1"/>
       </w:pPr>
-      <w:bookmarkStart w:id="12" w:name="_Toc242459448"/>
+      <w:bookmarkStart w:id="12" w:name="_Toc243049470"/>
       <w:r>
+        <w:lastRenderedPageBreak/>
         <w:t>Pruebas del reconocimiento de señas</w:t>
       </w:r>
       <w:bookmarkEnd w:id="12"/>
@@ -5865,18 +6161,14 @@
         <w:pStyle w:val="APATexto"/>
       </w:pPr>
       <w:r>
-        <w:t xml:space="preserve">Para las 20 palabras nuevas se usa el conjunto público LSC-54 (Mora-Zarate et al., </w:t>
+        <w:t>Para las 20 palabras nuevas se usa el conjunto público LSC-54 (Mora-Zarate et al., 2025), separando a los firmantes de entrenamiento y de prueba. La meta de aceptación es una precisión de al menos 85 % antes de publicar las plantillas. Esta medición está pendiente porque la descarga de los datos se detuvo por las restricciones del servidor de origen.</w:t>
       </w:r>
-      <w:r>
-        <w:lastRenderedPageBreak/>
-        <w:t>2025), separando a los firmantes de entrenamiento y de prueba. La meta de aceptación es una precisión de al menos 85 % antes de publicar las plantillas. Esta medición está pendiente porque la descarga de los datos se detuvo por las restricciones del servidor de origen.</w:t>
-      </w:r>
     </w:p>
     <w:p>
       <w:pPr>
         <w:pStyle w:val="Ttulo1"/>
       </w:pPr>
-      <w:bookmarkStart w:id="13" w:name="_Toc242459449"/>
+      <w:bookmarkStart w:id="13" w:name="_Toc243049471"/>
       <w:r>
         <w:t>Defectos encontrados</w:t>
       </w:r>
@@ -5913,7 +6205,7 @@
     <w:tbl>
       <w:tblPr>
         <w:tblStyle w:val="Tablaconcuadrcula"/>
-        <w:tblW w:w="0" w:type="auto"/>
+        <w:tblW w:w="5000" w:type="pct"/>
         <w:jc w:val="center"/>
         <w:tblInd w:w="0" w:type="dxa"/>
         <w:tblBorders>
@@ -5924,13 +6216,14 @@
           <w:insideH w:val="single" w:sz="4" w:space="0" w:color="000000"/>
           <w:insideV w:val="single" w:sz="4" w:space="0" w:color="000000"/>
         </w:tblBorders>
+        <w:tblLayout w:type="fixed"/>
         <w:tblLook w:val="04A0" w:firstRow="1" w:lastRow="0" w:firstColumn="1" w:lastColumn="0" w:noHBand="0" w:noVBand="1"/>
       </w:tblPr>
       <w:tblGrid>
-        <w:gridCol w:w="907"/>
-        <w:gridCol w:w="4989"/>
-        <w:gridCol w:w="1474"/>
-        <w:gridCol w:w="1701"/>
+        <w:gridCol w:w="935"/>
+        <w:gridCol w:w="3927"/>
+        <w:gridCol w:w="1309"/>
+        <w:gridCol w:w="3179"/>
       </w:tblGrid>
       <w:tr>
         <w:trPr>
@@ -5940,7 +6233,7 @@
         </w:trPr>
         <w:tc>
           <w:tcPr>
-            <w:tcW w:w="907" w:type="dxa"/>
+            <w:tcW w:w="500" w:type="pct"/>
           </w:tcPr>
           <w:p>
             <w:pPr>
@@ -5956,7 +6249,7 @@
         </w:tc>
         <w:tc>
           <w:tcPr>
-            <w:tcW w:w="4989" w:type="dxa"/>
+            <w:tcW w:w="2100" w:type="pct"/>
           </w:tcPr>
           <w:p>
             <w:pPr>
@@ -5972,7 +6265,7 @@
         </w:tc>
         <w:tc>
           <w:tcPr>
-            <w:tcW w:w="1474" w:type="dxa"/>
+            <w:tcW w:w="700" w:type="pct"/>
           </w:tcPr>
           <w:p>
             <w:pPr>
@@ -5988,7 +6281,7 @@
         </w:tc>
         <w:tc>
           <w:tcPr>
-            <w:tcW w:w="1701" w:type="dxa"/>
+            <w:tcW w:w="1700" w:type="pct"/>
           </w:tcPr>
           <w:p>
             <w:pPr>
@@ -6010,7 +6303,7 @@
         </w:trPr>
         <w:tc>
           <w:tcPr>
-            <w:tcW w:w="907" w:type="dxa"/>
+            <w:tcW w:w="500" w:type="pct"/>
           </w:tcPr>
           <w:p>
             <w:pPr>
@@ -6023,7 +6316,7 @@
         </w:tc>
         <w:tc>
           <w:tcPr>
-            <w:tcW w:w="4989" w:type="dxa"/>
+            <w:tcW w:w="2100" w:type="pct"/>
           </w:tcPr>
           <w:p>
             <w:pPr>
@@ -6036,7 +6329,7 @@
         </w:tc>
         <w:tc>
           <w:tcPr>
-            <w:tcW w:w="1474" w:type="dxa"/>
+            <w:tcW w:w="700" w:type="pct"/>
           </w:tcPr>
           <w:p>
             <w:pPr>
@@ -6049,7 +6342,7 @@
         </w:tc>
         <w:tc>
           <w:tcPr>
-            <w:tcW w:w="1701" w:type="dxa"/>
+            <w:tcW w:w="1700" w:type="pct"/>
           </w:tcPr>
           <w:p>
             <w:pPr>
@@ -6068,7 +6361,7 @@
         </w:trPr>
         <w:tc>
           <w:tcPr>
-            <w:tcW w:w="907" w:type="dxa"/>
+            <w:tcW w:w="500" w:type="pct"/>
           </w:tcPr>
           <w:p>
             <w:pPr>
@@ -6081,7 +6374,7 @@
         </w:tc>
         <w:tc>
           <w:tcPr>
-            <w:tcW w:w="4989" w:type="dxa"/>
+            <w:tcW w:w="2100" w:type="pct"/>
           </w:tcPr>
           <w:p>
             <w:pPr>
@@ -6094,7 +6387,7 @@
         </w:tc>
         <w:tc>
           <w:tcPr>
-            <w:tcW w:w="1474" w:type="dxa"/>
+            <w:tcW w:w="700" w:type="pct"/>
           </w:tcPr>
           <w:p>
             <w:pPr>
@@ -6107,7 +6400,7 @@
         </w:tc>
         <w:tc>
           <w:tcPr>
-            <w:tcW w:w="1701" w:type="dxa"/>
+            <w:tcW w:w="1700" w:type="pct"/>
           </w:tcPr>
           <w:p>
             <w:pPr>
@@ -6126,7 +6419,7 @@
         </w:trPr>
         <w:tc>
           <w:tcPr>
-            <w:tcW w:w="907" w:type="dxa"/>
+            <w:tcW w:w="500" w:type="pct"/>
           </w:tcPr>
           <w:p>
             <w:pPr>
@@ -6139,7 +6432,7 @@
         </w:tc>
         <w:tc>
           <w:tcPr>
-            <w:tcW w:w="4989" w:type="dxa"/>
+            <w:tcW w:w="2100" w:type="pct"/>
           </w:tcPr>
           <w:p>
             <w:pPr>
@@ -6152,7 +6445,7 @@
         </w:tc>
         <w:tc>
           <w:tcPr>
-            <w:tcW w:w="1474" w:type="dxa"/>
+            <w:tcW w:w="700" w:type="pct"/>
           </w:tcPr>
           <w:p>
             <w:pPr>
@@ -6165,7 +6458,7 @@
         </w:tc>
         <w:tc>
           <w:tcPr>
-            <w:tcW w:w="1701" w:type="dxa"/>
+            <w:tcW w:w="1700" w:type="pct"/>
           </w:tcPr>
           <w:p>
             <w:pPr>
@@ -6184,7 +6477,7 @@
         </w:trPr>
         <w:tc>
           <w:tcPr>
-            <w:tcW w:w="907" w:type="dxa"/>
+            <w:tcW w:w="500" w:type="pct"/>
           </w:tcPr>
           <w:p>
             <w:pPr>
@@ -6197,7 +6490,7 @@
         </w:tc>
         <w:tc>
           <w:tcPr>
-            <w:tcW w:w="4989" w:type="dxa"/>
+            <w:tcW w:w="2100" w:type="pct"/>
           </w:tcPr>
           <w:p>
             <w:pPr>
@@ -6210,7 +6503,7 @@
         </w:tc>
         <w:tc>
           <w:tcPr>
-            <w:tcW w:w="1474" w:type="dxa"/>
+            <w:tcW w:w="700" w:type="pct"/>
           </w:tcPr>
           <w:p>
             <w:pPr>
@@ -6223,14 +6516,14 @@
         </w:tc>
         <w:tc>
           <w:tcPr>
-            <w:tcW w:w="1701" w:type="dxa"/>
-          </w:tcPr>
-          <w:p>
-            <w:pPr>
-              <w:pStyle w:val="APACelda"/>
-            </w:pPr>
-            <w:r>
-              <w:t>En verificación</w:t>
+            <w:tcW w:w="1700" w:type="pct"/>
+          </w:tcPr>
+          <w:p>
+            <w:pPr>
+              <w:pStyle w:val="APACelda"/>
+            </w:pPr>
+            <w:r>
+              <w:t>Mitigado: el perfil faltante se crea al guardar las preferencias y hay un procedimiento de recuperación; la consulta sigue respondiendo 404 mientras falte</w:t>
             </w:r>
           </w:p>
         </w:tc>
@@ -6242,7 +6535,7 @@
         </w:trPr>
         <w:tc>
           <w:tcPr>
-            <w:tcW w:w="907" w:type="dxa"/>
+            <w:tcW w:w="500" w:type="pct"/>
           </w:tcPr>
           <w:p>
             <w:pPr>
@@ -6255,7 +6548,7 @@
         </w:tc>
         <w:tc>
           <w:tcPr>
-            <w:tcW w:w="4989" w:type="dxa"/>
+            <w:tcW w:w="2100" w:type="pct"/>
           </w:tcPr>
           <w:p>
             <w:pPr>
@@ -6268,7 +6561,7 @@
         </w:tc>
         <w:tc>
           <w:tcPr>
-            <w:tcW w:w="1474" w:type="dxa"/>
+            <w:tcW w:w="700" w:type="pct"/>
           </w:tcPr>
           <w:p>
             <w:pPr>
@@ -6281,14 +6574,188 @@
         </w:tc>
         <w:tc>
           <w:tcPr>
-            <w:tcW w:w="1701" w:type="dxa"/>
-          </w:tcPr>
-          <w:p>
-            <w:pPr>
-              <w:pStyle w:val="APACelda"/>
-            </w:pPr>
-            <w:r>
-              <w:t>Corregido: la suite actual tiene 494 de 494 en verde</w:t>
+            <w:tcW w:w="1700" w:type="pct"/>
+          </w:tcPr>
+          <w:p>
+            <w:pPr>
+              <w:pStyle w:val="APACelda"/>
+            </w:pPr>
+            <w:r>
+              <w:t>Corregido: la prueba pasa en la suite actual</w:t>
+            </w:r>
+          </w:p>
+        </w:tc>
+      </w:tr>
+      <w:tr>
+        <w:trPr>
+          <w:cantSplit/>
+          <w:jc w:val="center"/>
+        </w:trPr>
+        <w:tc>
+          <w:tcPr>
+            <w:tcW w:w="500" w:type="pct"/>
+          </w:tcPr>
+          <w:p>
+            <w:pPr>
+              <w:pStyle w:val="APACelda"/>
+            </w:pPr>
+            <w:r>
+              <w:t>DEF-06</w:t>
+            </w:r>
+          </w:p>
+        </w:tc>
+        <w:tc>
+          <w:tcPr>
+            <w:tcW w:w="2100" w:type="pct"/>
+          </w:tcPr>
+          <w:p>
+            <w:pPr>
+              <w:pStyle w:val="APACelda"/>
+            </w:pPr>
+            <w:r>
+              <w:t>La letra L nunca se reconoce: su forma de mano coincide antes con la regla de la D o la G</w:t>
+            </w:r>
+          </w:p>
+        </w:tc>
+        <w:tc>
+          <w:tcPr>
+            <w:tcW w:w="700" w:type="pct"/>
+          </w:tcPr>
+          <w:p>
+            <w:pPr>
+              <w:pStyle w:val="APACelda"/>
+            </w:pPr>
+            <w:r>
+              <w:t>Media</w:t>
+            </w:r>
+          </w:p>
+        </w:tc>
+        <w:tc>
+          <w:tcPr>
+            <w:tcW w:w="1700" w:type="pct"/>
+          </w:tcPr>
+          <w:p>
+            <w:pPr>
+              <w:pStyle w:val="APACelda"/>
+            </w:pPr>
+            <w:r>
+              <w:t>Abierto (encontrado con las pruebas unitarias del frontend)</w:t>
+            </w:r>
+          </w:p>
+        </w:tc>
+      </w:tr>
+      <w:tr>
+        <w:trPr>
+          <w:cantSplit/>
+          <w:jc w:val="center"/>
+        </w:trPr>
+        <w:tc>
+          <w:tcPr>
+            <w:tcW w:w="500" w:type="pct"/>
+          </w:tcPr>
+          <w:p>
+            <w:pPr>
+              <w:pStyle w:val="APACelda"/>
+            </w:pPr>
+            <w:r>
+              <w:t>DEF-07</w:t>
+            </w:r>
+          </w:p>
+        </w:tc>
+        <w:tc>
+          <w:tcPr>
+            <w:tcW w:w="2100" w:type="pct"/>
+          </w:tcPr>
+          <w:p>
+            <w:pPr>
+              <w:pStyle w:val="APACelda"/>
+            </w:pPr>
+            <w:r>
+              <w:t>Dos migraciones de iam-service con el mismo número (010) al integrar el borrado de cuenta</w:t>
+            </w:r>
+          </w:p>
+        </w:tc>
+        <w:tc>
+          <w:tcPr>
+            <w:tcW w:w="700" w:type="pct"/>
+          </w:tcPr>
+          <w:p>
+            <w:pPr>
+              <w:pStyle w:val="APACelda"/>
+            </w:pPr>
+            <w:r>
+              <w:t>Media</w:t>
+            </w:r>
+          </w:p>
+        </w:tc>
+        <w:tc>
+          <w:tcPr>
+            <w:tcW w:w="1700" w:type="pct"/>
+          </w:tcPr>
+          <w:p>
+            <w:pPr>
+              <w:pStyle w:val="APACelda"/>
+            </w:pPr>
+            <w:r>
+              <w:t>Corregido: renumerada a 012 antes del despliegue</w:t>
+            </w:r>
+          </w:p>
+        </w:tc>
+      </w:tr>
+      <w:tr>
+        <w:trPr>
+          <w:cantSplit/>
+          <w:jc w:val="center"/>
+        </w:trPr>
+        <w:tc>
+          <w:tcPr>
+            <w:tcW w:w="500" w:type="pct"/>
+          </w:tcPr>
+          <w:p>
+            <w:pPr>
+              <w:pStyle w:val="APACelda"/>
+            </w:pPr>
+            <w:r>
+              <w:t>DEF-08</w:t>
+            </w:r>
+          </w:p>
+        </w:tc>
+        <w:tc>
+          <w:tcPr>
+            <w:tcW w:w="2100" w:type="pct"/>
+          </w:tcPr>
+          <w:p>
+            <w:pPr>
+              <w:pStyle w:val="APACelda"/>
+            </w:pPr>
+            <w:r>
+              <w:t>Una prueba de recognition-service respondía 500 por la nueva protección de cuentas eliminadas</w:t>
+            </w:r>
+          </w:p>
+        </w:tc>
+        <w:tc>
+          <w:tcPr>
+            <w:tcW w:w="700" w:type="pct"/>
+          </w:tcPr>
+          <w:p>
+            <w:pPr>
+              <w:pStyle w:val="APACelda"/>
+            </w:pPr>
+            <w:r>
+              <w:t>Baja</w:t>
+            </w:r>
+          </w:p>
+        </w:tc>
+        <w:tc>
+          <w:tcPr>
+            <w:tcW w:w="1700" w:type="pct"/>
+          </w:tcPr>
+          <w:p>
+            <w:pPr>
+              <w:pStyle w:val="APACelda"/>
+            </w:pPr>
+            <w:r>
+              <w:t>Corregido: la prueba usa una conexión simulada</w:t>
             </w:r>
           </w:p>
         </w:tc>
@@ -6311,14 +6778,14 @@
         <w:rPr>
           <w:sz w:val="20"/>
         </w:rPr>
-        <w:t xml:space="preserve"> Los defectos provienen de la auditoría de código y seguridad de la fase 4 de la migración a microservicios.</w:t>
+        <w:t xml:space="preserve"> DEF-01 a DEF-05 provienen de la auditoría de código y seguridad de la fase 4 de la migración a microservicios; DEF-06 a DEF-08, de las pruebas unitarias del frontend y de la revisión de código del 16 de octubre de 2026.</w:t>
       </w:r>
     </w:p>
     <w:p>
       <w:pPr>
         <w:pStyle w:val="Ttulo1"/>
       </w:pPr>
-      <w:bookmarkStart w:id="14" w:name="_Toc242459450"/>
+      <w:bookmarkStart w:id="14" w:name="_Toc243049472"/>
       <w:r>
         <w:t>Conclusiones</w:t>
       </w:r>
@@ -6329,7 +6796,11 @@
         <w:pStyle w:val="APATexto"/>
       </w:pPr>
       <w:r>
-        <w:t>El backend supera la totalidad de su suite automatizada (494 pruebas, 0 fallas) y los flujos críticos de extremo a extremo funcionan con todos los servicios desplegados en Docker. Quedan pendientes las pruebas de rendimiento con k6, las pruebas con lector de pantalla, la medición de precisión del reconocimiento de las nuevas palabras y la prueba piloto con usuarios reales, que se programan para la siguiente iteración.</w:t>
+        <w:t xml:space="preserve">El backend supera la totalidad de su suite automatizada (683 pruebas: 681 aprobadas, 0 fallas y 2 omitidas por necesitar una base de datos de prueba) con 88,5 % de cobertura de </w:t>
+      </w:r>
+      <w:r>
+        <w:lastRenderedPageBreak/>
+        <w:t>líneas, por encima de la meta de 80 %. El frontend cuenta con sus primeras 79 pruebas unitarias, todas aprobadas, aunque su cobertura todavía es baja (4,5 %). Los flujos críticos de extremo a extremo funcionan con todos los servicios desplegados en Docker. Quedan pendientes la integración continua que ejecute las pruebas en cada cambio, ampliar las pruebas del frontend a las pantallas, las pruebas de rendimiento con k6, las pruebas con lector de pantalla, la medición de precisión del reconocimiento de las nuevas palabras y la prueba piloto con usuarios reales, que se programan para la siguiente iteración.</w:t>
       </w:r>
     </w:p>
     <w:p>
@@ -6337,7 +6808,7 @@
         <w:pStyle w:val="Ttulo1"/>
         <w:pageBreakBefore/>
       </w:pPr>
-      <w:bookmarkStart w:id="15" w:name="_Toc242459451"/>
+      <w:bookmarkStart w:id="15" w:name="_Toc243049473"/>
       <w:r>
         <w:lastRenderedPageBreak/>
         <w:t>Referencias</w:t>
@@ -9071,7 +9542,7 @@
       <w:lang w:val="es-CO"/>
     </w:rPr>
   </w:style>
-  <w:style w:type="character" w:styleId="Textoennegrita">
+  <w:style w:type="character" w:styleId="Fuerte">
     <w:name w:val="Strong"/>
     <w:basedOn w:val="Fuentedeprrafopredeter"/>
     <w:uiPriority w:val="22"/>

</xml_diff>